<commit_message>
Primer v9.9: fold new podcast-transcript findings (Earth AI, Mariana, Hadrian, Solugen, Phlow, Orbital, Radical, data loops); fix TOC; summaries 10-15% fix
</commit_message>
<xml_diff>
--- a/themes/ai-native-industrial-production/insights/exports/VII-podcast-summaries-2026-10-27.docx
+++ b/themes/ai-native-industrial-production/insights/exports/VII-podcast-summaries-2026-10-27.docx
@@ -1247,7 +1247,7 @@
         </w:numPr>
       </w:pPr>
       <w:r>
-        <w:t xml:space="preserve">Make vs buy: Mueller builds prototypes in-house to learn, then outsources production; even SpaceX now sends parts out (Hadrian is about to make Raptor parts). Power says every company should keep 10–50% in-house, but scale has to happen outside.</w:t>
+        <w:t xml:space="preserve">Make vs buy: Mueller builds prototypes in-house to learn, then outsources production; even SpaceX now sends parts out (Hadrian is about to make Raptor parts). Power says every company should keep 10–15% in-house, but scale has to happen outside.</w:t>
       </w:r>
     </w:p>
     <w:p>
@@ -1337,7 +1337,7 @@
         <w:t xml:space="preserve"> </w:t>
       </w:r>
       <w:r>
-        <w:t xml:space="preserve">SpaceX 165 launches last year and ~10,000 satellites (Mueller); China's parts cost about one-third of Hadrian's (Power); 10–50% in-house rule.</w:t>
+        <w:t xml:space="preserve">SpaceX 165 launches last year and ~10,000 satellites (Mueller); China's parts cost about one-third of Hadrian's (Power); 10–15% in-house rule.</w:t>
       </w:r>
     </w:p>
     <w:p>

</xml_diff>